<commit_message>
artefact: update TPRM policy to the non-bank MAS outsourcing guideline
Regenerate TPRM_Policy_PayWave.docx so its regulatory references cite the
MAS Guidelines on Outsourcing (Financial Institutions other than Banks)
— effective 11 Dec 2024 — in place of the superseded Guidelines on
Outsourcing (2018). Updated the compliance statement and the regulatory
references list, and added a v1.1 row to the Document Control table
recording the change. Document re-validated (schema PASSED).

Co-Authored-By: Claude Opus 4.8 <noreply@anthropic.com>
</commit_message>
<xml_diff>
--- a/public/downloads/TPRM_Policy_PayWave.docx
+++ b/public/downloads/TPRM_Policy_PayWave.docx
@@ -87,7 +87,7 @@
           <w:sz w:val="18"/>
           <w:szCs w:val="18"/>
         </w:rPr>
-        <w:t xml:space="preserve">This policy is established in compliance with: MAS Technology Risk Management (TRM) Guidelines Section 9 (Outsourcing), MAS Outsourcing Guidelines, ISO 27001:2022 controls A.5.19–A.5.22, and the Personal Data Protection Act (PDPA) data intermediary obligations.</w:t>
+        <w:t xml:space="preserve">This policy is established in compliance with: MAS Technology Risk Management (TRM) Guidelines Section 9 (Outsourcing), MAS Guidelines on Outsourcing (Financial Institutions other than Banks), ISO 27001:2022 controls A.5.19–A.5.22, and the Personal Data Protection Act (PDPA) data intermediary obligations.</w:t>
       </w:r>
     </w:p>
     <w:p>
@@ -1368,7 +1368,7 @@
           <w:sz w:val="18"/>
           <w:szCs w:val="18"/>
         </w:rPr>
-        <w:t xml:space="preserve">•  MAS Outsourcing Guidelines (October 2018, as amended)</w:t>
+        <w:t xml:space="preserve">•  MAS Guidelines on Outsourcing (Financial Institutions other than Banks) (effective 11 December 2024)</w:t>
       </w:r>
     </w:p>
     <w:p>
@@ -1750,6 +1750,153 @@
                 <w:szCs w:val="16"/>
               </w:rPr>
               <w:t xml:space="preserve">Initial issue</w:t>
+            </w:r>
+          </w:p>
+        </w:tc>
+      </w:tr>
+      <w:tr>
+        <w:tc>
+          <w:tcPr>
+            <w:tcW w:type="dxa" w:w="1800"/>
+            <w:tcBorders>
+              <w:top w:val="single" w:color="CCCCCC" w:sz="1"/>
+              <w:left w:val="single" w:color="CCCCCC" w:sz="1"/>
+              <w:bottom w:val="single" w:color="CCCCCC" w:sz="1"/>
+              <w:right w:val="single" w:color="CCCCCC" w:sz="1"/>
+            </w:tcBorders>
+            <w:tcMar>
+              <w:top w:type="dxa" w:w="60"/>
+              <w:left w:type="dxa" w:w="100"/>
+              <w:bottom w:type="dxa" w:w="60"/>
+              <w:right w:type="dxa" w:w="100"/>
+            </w:tcMar>
+          </w:tcPr>
+          <w:p>
+            <w:r>
+              <w:rPr>
+                <w:rFonts w:ascii="Arial" w:cs="Arial" w:eastAsia="Arial" w:hAnsi="Arial"/>
+                <w:b w:val="false"/>
+                <w:bCs w:val="false"/>
+                <w:sz w:val="16"/>
+                <w:szCs w:val="16"/>
+              </w:rPr>
+              <w:t xml:space="preserve">1.1</w:t>
+            </w:r>
+          </w:p>
+        </w:tc>
+        <w:tc>
+          <w:tcPr>
+            <w:tcW w:type="dxa" w:w="1800"/>
+            <w:tcBorders>
+              <w:top w:val="single" w:color="CCCCCC" w:sz="1"/>
+              <w:left w:val="single" w:color="CCCCCC" w:sz="1"/>
+              <w:bottom w:val="single" w:color="CCCCCC" w:sz="1"/>
+              <w:right w:val="single" w:color="CCCCCC" w:sz="1"/>
+            </w:tcBorders>
+            <w:tcMar>
+              <w:top w:type="dxa" w:w="60"/>
+              <w:left w:type="dxa" w:w="100"/>
+              <w:bottom w:type="dxa" w:w="60"/>
+              <w:right w:type="dxa" w:w="100"/>
+            </w:tcMar>
+          </w:tcPr>
+          <w:p>
+            <w:r>
+              <w:rPr>
+                <w:rFonts w:ascii="Arial" w:cs="Arial" w:eastAsia="Arial" w:hAnsi="Arial"/>
+                <w:b w:val="false"/>
+                <w:bCs w:val="false"/>
+                <w:sz w:val="16"/>
+                <w:szCs w:val="16"/>
+              </w:rPr>
+              <w:t xml:space="preserve">25 Jun 2026</w:t>
+            </w:r>
+          </w:p>
+        </w:tc>
+        <w:tc>
+          <w:tcPr>
+            <w:tcW w:type="dxa" w:w="1800"/>
+            <w:tcBorders>
+              <w:top w:val="single" w:color="CCCCCC" w:sz="1"/>
+              <w:left w:val="single" w:color="CCCCCC" w:sz="1"/>
+              <w:bottom w:val="single" w:color="CCCCCC" w:sz="1"/>
+              <w:right w:val="single" w:color="CCCCCC" w:sz="1"/>
+            </w:tcBorders>
+            <w:tcMar>
+              <w:top w:type="dxa" w:w="60"/>
+              <w:left w:type="dxa" w:w="100"/>
+              <w:bottom w:type="dxa" w:w="60"/>
+              <w:right w:type="dxa" w:w="100"/>
+            </w:tcMar>
+          </w:tcPr>
+          <w:p>
+            <w:r>
+              <w:rPr>
+                <w:rFonts w:ascii="Arial" w:cs="Arial" w:eastAsia="Arial" w:hAnsi="Arial"/>
+                <w:b w:val="false"/>
+                <w:bCs w:val="false"/>
+                <w:sz w:val="16"/>
+                <w:szCs w:val="16"/>
+              </w:rPr>
+              <w:t xml:space="preserve">[Your Name], GRC</w:t>
+            </w:r>
+          </w:p>
+        </w:tc>
+        <w:tc>
+          <w:tcPr>
+            <w:tcW w:type="dxa" w:w="1800"/>
+            <w:tcBorders>
+              <w:top w:val="single" w:color="CCCCCC" w:sz="1"/>
+              <w:left w:val="single" w:color="CCCCCC" w:sz="1"/>
+              <w:bottom w:val="single" w:color="CCCCCC" w:sz="1"/>
+              <w:right w:val="single" w:color="CCCCCC" w:sz="1"/>
+            </w:tcBorders>
+            <w:tcMar>
+              <w:top w:type="dxa" w:w="60"/>
+              <w:left w:type="dxa" w:w="100"/>
+              <w:bottom w:type="dxa" w:w="60"/>
+              <w:right w:type="dxa" w:w="100"/>
+            </w:tcMar>
+          </w:tcPr>
+          <w:p>
+            <w:r>
+              <w:rPr>
+                <w:rFonts w:ascii="Arial" w:cs="Arial" w:eastAsia="Arial" w:hAnsi="Arial"/>
+                <w:b w:val="false"/>
+                <w:bCs w:val="false"/>
+                <w:sz w:val="16"/>
+                <w:szCs w:val="16"/>
+              </w:rPr>
+              <w:t xml:space="preserve">CISO / CEO</w:t>
+            </w:r>
+          </w:p>
+        </w:tc>
+        <w:tc>
+          <w:tcPr>
+            <w:tcW w:type="dxa" w:w="2160"/>
+            <w:tcBorders>
+              <w:top w:val="single" w:color="CCCCCC" w:sz="1"/>
+              <w:left w:val="single" w:color="CCCCCC" w:sz="1"/>
+              <w:bottom w:val="single" w:color="CCCCCC" w:sz="1"/>
+              <w:right w:val="single" w:color="CCCCCC" w:sz="1"/>
+            </w:tcBorders>
+            <w:tcMar>
+              <w:top w:type="dxa" w:w="60"/>
+              <w:left w:type="dxa" w:w="100"/>
+              <w:bottom w:type="dxa" w:w="60"/>
+              <w:right w:type="dxa" w:w="100"/>
+            </w:tcMar>
+          </w:tcPr>
+          <w:p>
+            <w:r>
+              <w:rPr>
+                <w:rFonts w:ascii="Arial" w:cs="Arial" w:eastAsia="Arial" w:hAnsi="Arial"/>
+                <w:b w:val="false"/>
+                <w:bCs w:val="false"/>
+                <w:sz w:val="16"/>
+                <w:szCs w:val="16"/>
+              </w:rPr>
+              <w:t xml:space="preserve">Updated regulatory reference to the MAS Guidelines on Outsourcing (Financial Institutions other than Banks), effective 11 December 2024, replacing the superseded Guidelines on Outsourcing.</w:t>
             </w:r>
           </w:p>
         </w:tc>

</xml_diff>